<commit_message>
Updated Power BI report and RTO Word document with latest changes
</commit_message>
<xml_diff>
--- a/shiprocket_rto_report.docx
+++ b/shiprocket_rto_report.docx
@@ -138,13 +138,7 @@
         <w:rPr>
           <w:color w:val="6B7280"/>
         </w:rPr>
-        <w:t xml:space="preserve">    April</w:t>
-      </w:r>
-      <w:r>
-        <w:rPr>
-          <w:color w:val="6B7280"/>
-        </w:rPr>
-        <w:t xml:space="preserve"> 2026</w:t>
+        <w:t xml:space="preserve">    April 2026</w:t>
       </w:r>
     </w:p>
     <w:p>
@@ -294,8 +288,13 @@
           <w:bottom w:val="single" w:sz="6" w:space="4" w:color="2563EB"/>
         </w:pBdr>
       </w:pPr>
+      <w:proofErr w:type="gramStart"/>
       <w:r>
-        <w:t xml:space="preserve">1.1  Why RTO Is </w:t>
+        <w:t>1.1  Why</w:t>
+      </w:r>
+      <w:proofErr w:type="gramEnd"/>
+      <w:r>
+        <w:t xml:space="preserve"> RTO Is </w:t>
       </w:r>
       <w:proofErr w:type="spellStart"/>
       <w:r>
@@ -661,8 +660,13 @@
           <w:bottom w:val="single" w:sz="6" w:space="4" w:color="2563EB"/>
         </w:pBdr>
       </w:pPr>
+      <w:proofErr w:type="gramStart"/>
       <w:r>
-        <w:t>1.2  Root Cause Taxonomy</w:t>
+        <w:t>1.2  Root</w:t>
+      </w:r>
+      <w:proofErr w:type="gramEnd"/>
+      <w:r>
+        <w:t xml:space="preserve"> Cause Taxonomy</w:t>
       </w:r>
     </w:p>
     <w:p>
@@ -1555,8 +1559,13 @@
           <w:bottom w:val="single" w:sz="6" w:space="4" w:color="2563EB"/>
         </w:pBdr>
       </w:pPr>
+      <w:proofErr w:type="gramStart"/>
       <w:r>
-        <w:t>2.1  Nine-Stage Journey Map with Pain Point Attribution</w:t>
+        <w:t>2.1  Nine</w:t>
+      </w:r>
+      <w:proofErr w:type="gramEnd"/>
+      <w:r>
+        <w:t>-Stage Journey Map with Pain Point Attribution</w:t>
       </w:r>
     </w:p>
     <w:p>
@@ -1581,7 +1590,21 @@
         <w:rPr>
           <w:color w:val="374151"/>
         </w:rPr>
-        <w:t xml:space="preserve"> was constructed to identify which stages generate which root causes. This matters because most existing Shiprocket products (RADAR, </w:t>
+        <w:t xml:space="preserve"> was constructed to identify which stages generate which root causes. This matters because most existing </w:t>
+      </w:r>
+      <w:proofErr w:type="spellStart"/>
+      <w:r>
+        <w:rPr>
+          <w:color w:val="374151"/>
+        </w:rPr>
+        <w:t>Shiprocket</w:t>
+      </w:r>
+      <w:proofErr w:type="spellEnd"/>
+      <w:r>
+        <w:rPr>
+          <w:color w:val="374151"/>
+        </w:rPr>
+        <w:t xml:space="preserve"> products (RADAR, </w:t>
       </w:r>
       <w:proofErr w:type="spellStart"/>
       <w:r>
@@ -1621,11 +1644,11 @@
         <w:tblLook w:val="0000" w:firstRow="0" w:lastRow="0" w:firstColumn="0" w:lastColumn="0" w:noHBand="0" w:noVBand="0"/>
       </w:tblPr>
       <w:tblGrid>
-        <w:gridCol w:w="1578"/>
-        <w:gridCol w:w="1762"/>
+        <w:gridCol w:w="1577"/>
+        <w:gridCol w:w="1761"/>
         <w:gridCol w:w="1741"/>
-        <w:gridCol w:w="2113"/>
-        <w:gridCol w:w="2166"/>
+        <w:gridCol w:w="2119"/>
+        <w:gridCol w:w="2162"/>
       </w:tblGrid>
       <w:tr>
         <w:trPr>
@@ -1928,15 +1951,31 @@
             </w:tcMar>
           </w:tcPr>
           <w:p>
-            <w:r>
+            <w:pPr>
               <w:rPr>
                 <w:color w:val="EA580C"/>
                 <w:sz w:val="20"/>
                 <w:szCs w:val="20"/>
               </w:rPr>
-              <w:t>Low</w:t>
-            </w:r>
-          </w:p>
+            </w:pPr>
+            <w:r>
+              <w:rPr>
+                <w:color w:val="EA580C"/>
+                <w:sz w:val="20"/>
+                <w:szCs w:val="20"/>
+              </w:rPr>
+              <w:t>N</w:t>
+            </w:r>
+            <w:r>
+              <w:rPr>
+                <w:color w:val="EA580C"/>
+                <w:sz w:val="20"/>
+                <w:szCs w:val="20"/>
+              </w:rPr>
+              <w:t>egligible</w:t>
+            </w:r>
+          </w:p>
+          <w:p/>
         </w:tc>
       </w:tr>
       <w:tr>
@@ -2070,15 +2109,31 @@
             </w:tcMar>
           </w:tcPr>
           <w:p>
-            <w:r>
+            <w:pPr>
               <w:rPr>
                 <w:color w:val="EA580C"/>
                 <w:sz w:val="20"/>
                 <w:szCs w:val="20"/>
               </w:rPr>
-              <w:t>Low</w:t>
-            </w:r>
-          </w:p>
+            </w:pPr>
+            <w:r>
+              <w:rPr>
+                <w:color w:val="EA580C"/>
+                <w:sz w:val="20"/>
+                <w:szCs w:val="20"/>
+              </w:rPr>
+              <w:t>N</w:t>
+            </w:r>
+            <w:r>
+              <w:rPr>
+                <w:color w:val="EA580C"/>
+                <w:sz w:val="20"/>
+                <w:szCs w:val="20"/>
+              </w:rPr>
+              <w:t>egligible</w:t>
+            </w:r>
+          </w:p>
+          <w:p/>
         </w:tc>
       </w:tr>
       <w:tr>
@@ -2212,15 +2267,23 @@
             </w:tcMar>
           </w:tcPr>
           <w:p>
-            <w:r>
+            <w:pPr>
               <w:rPr>
                 <w:color w:val="D97706"/>
                 <w:sz w:val="20"/>
                 <w:szCs w:val="20"/>
               </w:rPr>
-              <w:t>Medium</w:t>
-            </w:r>
-          </w:p>
+            </w:pPr>
+            <w:r>
+              <w:rPr>
+                <w:color w:val="D97706"/>
+                <w:sz w:val="20"/>
+                <w:szCs w:val="20"/>
+              </w:rPr>
+              <w:t>Low–Medium</w:t>
+            </w:r>
+          </w:p>
+          <w:p/>
         </w:tc>
       </w:tr>
       <w:tr>
@@ -2354,15 +2417,23 @@
             </w:tcMar>
           </w:tcPr>
           <w:p>
-            <w:r>
+            <w:pPr>
               <w:rPr>
                 <w:color w:val="D97706"/>
                 <w:sz w:val="20"/>
                 <w:szCs w:val="20"/>
               </w:rPr>
-              <w:t>Medium</w:t>
-            </w:r>
-          </w:p>
+            </w:pPr>
+            <w:r>
+              <w:rPr>
+                <w:color w:val="D97706"/>
+                <w:sz w:val="20"/>
+                <w:szCs w:val="20"/>
+              </w:rPr>
+              <w:t>Low–Medium</w:t>
+            </w:r>
+          </w:p>
+          <w:p/>
         </w:tc>
       </w:tr>
       <w:tr>
@@ -2486,13 +2557,20 @@
             </w:tcMar>
           </w:tcPr>
           <w:p>
-            <w:r>
-              <w:rPr>
-                <w:color w:val="374151"/>
-                <w:sz w:val="20"/>
-                <w:szCs w:val="20"/>
-              </w:rPr>
-              <w:t>Courier mismatch, SLA risk</w:t>
+            <w:pPr>
+              <w:rPr>
+                <w:color w:val="374151"/>
+                <w:sz w:val="20"/>
+                <w:szCs w:val="20"/>
+              </w:rPr>
+            </w:pPr>
+            <w:r>
+              <w:rPr>
+                <w:color w:val="374151"/>
+                <w:sz w:val="20"/>
+                <w:szCs w:val="20"/>
+              </w:rPr>
+              <w:t>Wrong courier assignment, serviceability</w:t>
             </w:r>
           </w:p>
         </w:tc>
@@ -2628,13 +2706,20 @@
             </w:tcMar>
           </w:tcPr>
           <w:p>
-            <w:r>
-              <w:rPr>
-                <w:color w:val="374151"/>
-                <w:sz w:val="20"/>
-                <w:szCs w:val="20"/>
-              </w:rPr>
-              <w:t>Phone pickup, address accuracy, SLA</w:t>
+            <w:pPr>
+              <w:rPr>
+                <w:color w:val="374151"/>
+                <w:sz w:val="20"/>
+                <w:szCs w:val="20"/>
+              </w:rPr>
+            </w:pPr>
+            <w:r>
+              <w:rPr>
+                <w:color w:val="374151"/>
+                <w:sz w:val="20"/>
+                <w:szCs w:val="20"/>
+              </w:rPr>
+              <w:t>Address accuracy, customer unavailability</w:t>
             </w:r>
           </w:p>
         </w:tc>
@@ -2770,13 +2855,20 @@
             </w:tcMar>
           </w:tcPr>
           <w:p>
-            <w:r>
-              <w:rPr>
-                <w:color w:val="374151"/>
-                <w:sz w:val="20"/>
-                <w:szCs w:val="20"/>
-              </w:rPr>
-              <w:t>Reattempt policy, customer cooperation</w:t>
+            <w:pPr>
+              <w:rPr>
+                <w:color w:val="374151"/>
+                <w:sz w:val="20"/>
+                <w:szCs w:val="20"/>
+              </w:rPr>
+            </w:pPr>
+            <w:r>
+              <w:rPr>
+                <w:color w:val="374151"/>
+                <w:sz w:val="20"/>
+                <w:szCs w:val="20"/>
+              </w:rPr>
+              <w:t>Weak reattempt process, low customer cooperation</w:t>
             </w:r>
           </w:p>
         </w:tc>
@@ -2918,7 +3010,15 @@
                 <w:sz w:val="20"/>
                 <w:szCs w:val="20"/>
               </w:rPr>
-              <w:t>All four root causes converge here</w:t>
+              <w:t xml:space="preserve">All root causes converge </w:t>
+            </w:r>
+            <w:r>
+              <w:rPr>
+                <w:color w:val="374151"/>
+                <w:sz w:val="20"/>
+                <w:szCs w:val="20"/>
+              </w:rPr>
+              <w:t>to trigger RTO</w:t>
             </w:r>
           </w:p>
         </w:tc>
@@ -3054,13 +3154,28 @@
             </w:tcMar>
           </w:tcPr>
           <w:p>
-            <w:r>
-              <w:rPr>
-                <w:color w:val="374151"/>
-                <w:sz w:val="20"/>
-                <w:szCs w:val="20"/>
-              </w:rPr>
-              <w:t>Hidden surcharges, COD delay</w:t>
+            <w:pPr>
+              <w:rPr>
+                <w:color w:val="374151"/>
+                <w:sz w:val="20"/>
+                <w:szCs w:val="20"/>
+              </w:rPr>
+            </w:pPr>
+            <w:r>
+              <w:rPr>
+                <w:color w:val="374151"/>
+                <w:sz w:val="20"/>
+                <w:szCs w:val="20"/>
+              </w:rPr>
+              <w:t xml:space="preserve">Hidden surcharges, COD </w:t>
+            </w:r>
+            <w:r>
+              <w:rPr>
+                <w:color w:val="374151"/>
+                <w:sz w:val="20"/>
+                <w:szCs w:val="20"/>
+              </w:rPr>
+              <w:t>remittance delay</w:t>
             </w:r>
           </w:p>
         </w:tc>
@@ -3203,8 +3318,13 @@
           <w:bottom w:val="single" w:sz="6" w:space="4" w:color="2563EB"/>
         </w:pBdr>
       </w:pPr>
+      <w:proofErr w:type="gramStart"/>
       <w:r>
-        <w:t>3.1  Ghost Customer Deterrence System</w:t>
+        <w:t>3.1  Ghost</w:t>
+      </w:r>
+      <w:proofErr w:type="gramEnd"/>
+      <w:r>
+        <w:t xml:space="preserve"> Customer Deterrence System</w:t>
       </w:r>
     </w:p>
     <w:p>
@@ -3222,8 +3342,13 @@
       <w:pPr>
         <w:pStyle w:val="Heading3"/>
       </w:pPr>
+      <w:proofErr w:type="gramStart"/>
       <w:r>
-        <w:t>3.1.1  Phone Number OTP Verification at Checkout</w:t>
+        <w:t>3.1.1  Phone</w:t>
+      </w:r>
+      <w:proofErr w:type="gramEnd"/>
+      <w:r>
+        <w:t xml:space="preserve"> Number OTP Verification at Checkout</w:t>
       </w:r>
     </w:p>
     <w:p>
@@ -3241,8 +3366,13 @@
       <w:pPr>
         <w:pStyle w:val="Heading3"/>
       </w:pPr>
+      <w:proofErr w:type="gramStart"/>
       <w:r>
-        <w:t>3.1.2  Risk-Scaled Refundable Deposit (Prepaid Orders)</w:t>
+        <w:t>3.1.2  Risk</w:t>
+      </w:r>
+      <w:proofErr w:type="gramEnd"/>
+      <w:r>
+        <w:t>-Scaled Refundable Deposit (Prepaid Orders)</w:t>
       </w:r>
     </w:p>
     <w:p>
@@ -3274,8 +3404,13 @@
       <w:pPr>
         <w:pStyle w:val="Heading3"/>
       </w:pPr>
+      <w:proofErr w:type="gramStart"/>
       <w:r>
-        <w:t>3.1.3  COD Friction Surcharge (COD Orders)</w:t>
+        <w:t>3.1.3  COD</w:t>
+      </w:r>
+      <w:proofErr w:type="gramEnd"/>
+      <w:r>
+        <w:t xml:space="preserve"> Friction Surcharge (COD Orders)</w:t>
       </w:r>
     </w:p>
     <w:p>
@@ -3365,7 +3500,41 @@
                 <w:sz w:val="21"/>
                 <w:szCs w:val="21"/>
               </w:rPr>
-              <w:t xml:space="preserve"> native checkout product. Sellers on third-party storefronts (Shopify, WooCommerce) would require SDK-level integration. This should be stated as a scoping constraint in any feature spec.</w:t>
+              <w:t xml:space="preserve"> native checkout product. Sellers on third-party storefronts (Shopify, WooCommerce) would require SDK-level integration. </w:t>
+            </w:r>
+            <w:proofErr w:type="gramStart"/>
+            <w:r>
+              <w:rPr>
+                <w:color w:val="374151"/>
+                <w:sz w:val="21"/>
+                <w:szCs w:val="21"/>
+              </w:rPr>
+              <w:t>Th</w:t>
+            </w:r>
+            <w:r>
+              <w:rPr>
+                <w:color w:val="374151"/>
+                <w:sz w:val="21"/>
+                <w:szCs w:val="21"/>
+              </w:rPr>
+              <w:t>erefore</w:t>
+            </w:r>
+            <w:proofErr w:type="gramEnd"/>
+            <w:r>
+              <w:rPr>
+                <w:color w:val="374151"/>
+                <w:sz w:val="21"/>
+                <w:szCs w:val="21"/>
+              </w:rPr>
+              <w:t xml:space="preserve"> this is </w:t>
+            </w:r>
+            <w:r>
+              <w:rPr>
+                <w:color w:val="374151"/>
+                <w:sz w:val="21"/>
+                <w:szCs w:val="21"/>
+              </w:rPr>
+              <w:t>a scoping constraint in any feature spec.</w:t>
             </w:r>
           </w:p>
         </w:tc>
@@ -3383,8 +3552,13 @@
           <w:bottom w:val="single" w:sz="6" w:space="4" w:color="2563EB"/>
         </w:pBdr>
       </w:pPr>
+      <w:proofErr w:type="gramStart"/>
       <w:r>
-        <w:t>3.2  Pre-Delivery Engagement &amp; Neighbour Delivery (NDR Reduction)</w:t>
+        <w:t>3.2  Pre</w:t>
+      </w:r>
+      <w:proofErr w:type="gramEnd"/>
+      <w:r>
+        <w:t>-Delivery Engagement &amp; Neighbour Delivery (NDR Reduction)</w:t>
       </w:r>
     </w:p>
     <w:p>
@@ -3463,8 +3637,13 @@
           <w:bottom w:val="single" w:sz="6" w:space="4" w:color="2563EB"/>
         </w:pBdr>
       </w:pPr>
+      <w:proofErr w:type="gramStart"/>
       <w:r>
-        <w:t>3.3  Address Quality: Pin-Drop Default</w:t>
+        <w:t>3.3  Address</w:t>
+      </w:r>
+      <w:proofErr w:type="gramEnd"/>
+      <w:r>
+        <w:t xml:space="preserve"> Quality: Pin-Drop Default</w:t>
       </w:r>
     </w:p>
     <w:p>
@@ -3475,7 +3654,19 @@
         <w:rPr>
           <w:color w:val="374151"/>
         </w:rPr>
-        <w:t>Addresses entered as free text are a significant source of NDR (22% of root causes). The proposed UX change: increase the visual prominence of the pin-drop/map option at checkout and reduce the prominence of the manual text field. When pin-drop is used, the system auto-generates a structured text address which the customer confirms. This is low-effort, low-risk, and estimated at 1–2% RTO reduction in isolation — included as a quick win rather than a headline feature.</w:t>
+        <w:t>Addresses entered as free text are a significant source of NDR (22% of root causes). The proposed UX change: increase the visual prominence of the pin-drop/map option at checkout and reduce the prominence of the manual text field. When pin-drop is used, the system auto-generates a structured text address which the customer confirms. This is low-effort, low-risk</w:t>
+      </w:r>
+      <w:r>
+        <w:rPr>
+          <w:color w:val="374151"/>
+        </w:rPr>
+        <w:t xml:space="preserve"> </w:t>
+      </w:r>
+      <w:r>
+        <w:rPr>
+          <w:color w:val="374151"/>
+        </w:rPr>
+        <w:t>reduction in isolation — included as a quick win rather than a headline feature.</w:t>
       </w:r>
     </w:p>
     <w:p>
@@ -3490,8 +3681,13 @@
           <w:bottom w:val="single" w:sz="6" w:space="4" w:color="2563EB"/>
         </w:pBdr>
       </w:pPr>
+      <w:proofErr w:type="gramStart"/>
       <w:r>
-        <w:t>3.4  Listing Quality Signal (Return Rate Reduction)</w:t>
+        <w:t>3.4  Listing</w:t>
+      </w:r>
+      <w:proofErr w:type="gramEnd"/>
+      <w:r>
+        <w:t xml:space="preserve"> Quality Signal (Return Rate Reduction)</w:t>
       </w:r>
     </w:p>
     <w:p>
@@ -3592,8 +3788,13 @@
           <w:bottom w:val="single" w:sz="6" w:space="4" w:color="2563EB"/>
         </w:pBdr>
       </w:pPr>
+      <w:proofErr w:type="gramStart"/>
       <w:r>
-        <w:t>4.1  Design Philosophy</w:t>
+        <w:t>4.1  Design</w:t>
+      </w:r>
+      <w:proofErr w:type="gramEnd"/>
+      <w:r>
+        <w:t xml:space="preserve"> Philosophy</w:t>
       </w:r>
     </w:p>
     <w:p>
@@ -3671,7 +3872,23 @@
                 <w:sz w:val="21"/>
                 <w:szCs w:val="21"/>
               </w:rPr>
-              <w:t>A product analyst's job is to demonstrate reasoning about the problem domain, not to demonstrate ability to run pandas on whatever data is available. A simulation that encodes domain knowledge (COD→RTO multiplier, tier-3 address-quality degradation, ghost-customer behavioural fingerprint) is a stronger artefact than a generic analysis, because every parameter in it is a defensible hypothesis.</w:t>
+              <w:t>A produ</w:t>
+            </w:r>
+            <w:r>
+              <w:rPr>
+                <w:color w:val="374151"/>
+                <w:sz w:val="21"/>
+                <w:szCs w:val="21"/>
+              </w:rPr>
+              <w:t>ct</w:t>
+            </w:r>
+            <w:r>
+              <w:rPr>
+                <w:color w:val="374151"/>
+                <w:sz w:val="21"/>
+                <w:szCs w:val="21"/>
+              </w:rPr>
+              <w:t xml:space="preserve"> analyst's job is to demonstrate reasoning about the problem domain, not to demonstrate ability to run pandas on whatever data is available. A simulation that encodes domain knowledge (COD→RTO multiplier, tier-3 address-quality degradation, ghost-customer behavioural fingerprint) is a stronger artefact than a generic analysis, because every parameter in it is a defensible hypothesis.</w:t>
             </w:r>
           </w:p>
         </w:tc>
@@ -3689,8 +3906,13 @@
           <w:bottom w:val="single" w:sz="6" w:space="4" w:color="2563EB"/>
         </w:pBdr>
       </w:pPr>
+      <w:proofErr w:type="gramStart"/>
       <w:r>
-        <w:t>4.2  Customer Persona Architecture</w:t>
+        <w:t>4.2  Customer</w:t>
+      </w:r>
+      <w:proofErr w:type="gramEnd"/>
+      <w:r>
+        <w:t xml:space="preserve"> Persona Architecture</w:t>
       </w:r>
     </w:p>
     <w:p>
@@ -5158,8 +5380,13 @@
           <w:bottom w:val="single" w:sz="6" w:space="4" w:color="2563EB"/>
         </w:pBdr>
       </w:pPr>
+      <w:proofErr w:type="gramStart"/>
       <w:r>
-        <w:t>4.3  Two-Gate Risk Architecture</w:t>
+        <w:t>4.3  Two</w:t>
+      </w:r>
+      <w:proofErr w:type="gramEnd"/>
+      <w:r>
+        <w:t>-Gate Risk Architecture</w:t>
       </w:r>
     </w:p>
     <w:p>
@@ -5757,8 +5984,13 @@
           <w:bottom w:val="single" w:sz="6" w:space="4" w:color="2563EB"/>
         </w:pBdr>
       </w:pPr>
+      <w:proofErr w:type="gramStart"/>
       <w:r>
-        <w:t>4.4  Ghost Customer Detection Logic</w:t>
+        <w:t>4.4  Ghost</w:t>
+      </w:r>
+      <w:proofErr w:type="gramEnd"/>
+      <w:r>
+        <w:t xml:space="preserve"> Customer Detection Logic</w:t>
       </w:r>
     </w:p>
     <w:p>
@@ -5932,8 +6164,13 @@
           <w:bottom w:val="single" w:sz="6" w:space="4" w:color="2563EB"/>
         </w:pBdr>
       </w:pPr>
+      <w:proofErr w:type="gramStart"/>
       <w:r>
-        <w:t>5.1  Dashboard Architecture</w:t>
+        <w:t>5.1  Dashboard</w:t>
+      </w:r>
+      <w:proofErr w:type="gramEnd"/>
+      <w:r>
+        <w:t xml:space="preserve"> Architecture</w:t>
       </w:r>
     </w:p>
     <w:p>
@@ -5956,7 +6193,7 @@
         <w:rPr>
           <w:color w:val="374151"/>
         </w:rPr>
-        <w:t xml:space="preserve"> pages, each answering a distinct diagnostic question. The goal is a narrative flow that moves from headline rates → root cause → customer-level behaviour → financial impact → opportunity sizing — the same structure a senior PM would use in a business review.</w:t>
+        <w:t xml:space="preserve"> pages, each answering a distinct diagnostic question. The goal is a narrative flow that moves from headline rates → customer-level behaviour → financial impact → opportunity sizing — the same structure a senior PM would use in a business review.</w:t>
       </w:r>
     </w:p>
     <w:p>
@@ -5971,8 +6208,13 @@
           <w:bottom w:val="single" w:sz="6" w:space="4" w:color="2563EB"/>
         </w:pBdr>
       </w:pPr>
+      <w:proofErr w:type="gramStart"/>
       <w:r>
-        <w:t>5.2  Key Findings by Dashboard Page</w:t>
+        <w:t>5.2  Key</w:t>
+      </w:r>
+      <w:proofErr w:type="gramEnd"/>
+      <w:r>
+        <w:t xml:space="preserve"> Findings by Dashboard Page</w:t>
       </w:r>
     </w:p>
     <w:p>
@@ -6868,7 +7110,19 @@
         <w:rPr>
           <w:color w:val="374151"/>
         </w:rPr>
-        <w:t>The dashboard shows approximately 19,000 RTO orders against ~32,000 NDR orders — meaning the NDR-to-RTO conversion rate is approximately 59%. This is the most actionable efficiency metric in the report: if 59% of failed deliveries become RTOs (with no recovery), there is a 41% "rescue rate" on NDRs that can be expanded. The Phase 1 reschedule-nudge intervention specifically targets this conversion rate — a 10-point improvement in NDR rescue rate would eliminate roughly 3,200 RTOs per 100,000 orders.</w:t>
+        <w:t>The</w:t>
+      </w:r>
+      <w:r>
+        <w:rPr>
+          <w:color w:val="374151"/>
+        </w:rPr>
+        <w:t xml:space="preserve">re are about </w:t>
+      </w:r>
+      <w:r>
+        <w:rPr>
+          <w:color w:val="374151"/>
+        </w:rPr>
+        <w:t>19,000 RTO orders against ~32,000 NDR orders — meaning the NDR-to-RTO conversion rate is approximately 59%. This is the most actionable efficiency metric in the report: if 59% of failed deliveries become RTOs (with no recovery), there is a 41% "rescue rate" on NDRs that can be expanded. The Phase 1 reschedule-nudge intervention specifically targets this conversion rate — a 10-point improvement in NDR rescue rate would eliminate roughly 3,200 RTOs per 100,000 orders.</w:t>
       </w:r>
     </w:p>
     <w:p>
@@ -6884,7 +7138,7 @@
         <w:rPr>
           <w:color w:val="374151"/>
         </w:rPr>
-        <w:t>The line chart reveals a concerning downward trend: first-attempt success rate moves from ~0.83 at the start of the data period to ~0.79 by the end. This is the canonical "is the problem getting better or worse" metric. A declining trend in the absence of volume growth is a signal of structural degradation in delivery quality — not random noise. This trend line alone justifies an NDR-reduction initiative as urgent rather than aspirational.</w:t>
+        <w:t xml:space="preserve">The first-attempt success rate moves from ~0.83 at the start of the data period to ~0.79 by the end. This is the canonical "is the problem getting better or worse" metric. A declining trend in the absence of volume growth is a signal of structural degradation in delivery quality. </w:t>
       </w:r>
     </w:p>
     <w:p>
@@ -6895,79 +7149,29 @@
     <w:p>
       <w:pPr>
         <w:spacing w:before="80" w:after="80"/>
+        <w:rPr>
+          <w:color w:val="374151"/>
+        </w:rPr>
       </w:pPr>
       <w:r>
         <w:rPr>
           <w:color w:val="374151"/>
         </w:rPr>
-        <w:lastRenderedPageBreak/>
-        <w:t>The clustered chart by category × listing quality (Strong vs Weak) provides the clearest evidence for the listing-quality intervention. In fashion — the highest-return category (30%+ return rate) — weak listings (no customer photos + no size chart) show nearly double the return rate compared to strong listings. This is the data evidence behind Solution #4, reframed as a listing-analytics signal rather than a photography mandate.</w:t>
+        <w:t xml:space="preserve">In fashion — the highest-return category (30%+ return rate) — weak listings (no customer photos + no size chart) </w:t>
+      </w:r>
+      <w:r>
+        <w:rPr>
+          <w:color w:val="374151"/>
+        </w:rPr>
+        <w:t>has</w:t>
+      </w:r>
+      <w:r>
+        <w:rPr>
+          <w:color w:val="374151"/>
+        </w:rPr>
+        <w:t xml:space="preserve"> nearly double the return rate compared to strong listings. This is the data evidence behind Solution #4, reframed as a listing-analytics signal rather than a photography mandate.</w:t>
       </w:r>
     </w:p>
-    <w:tbl>
-      <w:tblPr>
-        <w:tblW w:w="9360" w:type="dxa"/>
-        <w:tblBorders>
-          <w:top w:val="single" w:sz="4" w:space="0" w:color="auto"/>
-          <w:left w:val="single" w:sz="4" w:space="0" w:color="auto"/>
-          <w:bottom w:val="single" w:sz="4" w:space="0" w:color="auto"/>
-          <w:right w:val="single" w:sz="4" w:space="0" w:color="auto"/>
-          <w:insideH w:val="single" w:sz="4" w:space="0" w:color="auto"/>
-          <w:insideV w:val="single" w:sz="4" w:space="0" w:color="auto"/>
-        </w:tblBorders>
-        <w:tblCellMar>
-          <w:left w:w="10" w:type="dxa"/>
-          <w:right w:w="10" w:type="dxa"/>
-        </w:tblCellMar>
-        <w:tblLook w:val="0000" w:firstRow="0" w:lastRow="0" w:firstColumn="0" w:lastColumn="0" w:noHBand="0" w:noVBand="0"/>
-      </w:tblPr>
-      <w:tblGrid>
-        <w:gridCol w:w="9360"/>
-      </w:tblGrid>
-      <w:tr>
-        <w:tc>
-          <w:tcPr>
-            <w:tcW w:w="9360" w:type="dxa"/>
-            <w:tcBorders>
-              <w:top w:val="none" w:sz="0" w:space="0" w:color="FFFFFF"/>
-              <w:left w:val="single" w:sz="18" w:space="0" w:color="2563EB"/>
-              <w:bottom w:val="none" w:sz="0" w:space="0" w:color="FFFFFF"/>
-              <w:right w:val="none" w:sz="0" w:space="0" w:color="FFFFFF"/>
-            </w:tcBorders>
-            <w:shd w:val="clear" w:color="auto" w:fill="DBEAFE"/>
-            <w:tcMar>
-              <w:top w:w="100" w:type="dxa"/>
-              <w:left w:w="200" w:type="dxa"/>
-              <w:bottom w:w="100" w:type="dxa"/>
-              <w:right w:w="160" w:type="dxa"/>
-            </w:tcMar>
-          </w:tcPr>
-          <w:p>
-            <w:pPr>
-              <w:spacing w:after="60"/>
-            </w:pPr>
-            <w:r>
-              <w:rPr>
-                <w:b/>
-                <w:bCs/>
-                <w:color w:val="1B3A6B"/>
-              </w:rPr>
-              <w:t>Insight for Interview</w:t>
-            </w:r>
-          </w:p>
-          <w:p>
-            <w:r>
-              <w:rPr>
-                <w:color w:val="374151"/>
-                <w:sz w:val="21"/>
-                <w:szCs w:val="21"/>
-              </w:rPr>
-              <w:t>The fashion category shows a 0.41 post-delivery return rate for weak listings versus approximately 0.20 for strong listings. A 1-percentage-point reduction in fashion returns across a seller with ₹10 lakh GMV/month saves approximately ₹8,000–15,000/month in reverse logistics — without touching the RTO funnel at all.</w:t>
-            </w:r>
-          </w:p>
-        </w:tc>
-      </w:tr>
-    </w:tbl>
     <w:p>
       <w:pPr>
         <w:pStyle w:val="Heading3"/>
@@ -7027,6 +7231,7 @@
                 <w:sz w:val="52"/>
                 <w:szCs w:val="52"/>
               </w:rPr>
+              <w:lastRenderedPageBreak/>
               <w:t>4K</w:t>
             </w:r>
           </w:p>
@@ -7540,7 +7745,19 @@
         <w:rPr>
           <w:color w:val="374151"/>
         </w:rPr>
-        <w:t>The gauge visual shows current COD RTO rate at 0.18 (coincidentally at the target) — this is because the simulation's persona mix is calibrated to slightly below India's real-world benchmark. In a real deployment with actual Shiprocket data, the COD RTO rate would read 20–30% for most seller cohorts, making the savings figure materially larger. The model structure is correct; the calibration is a function of persona weights, which are documented and adjustable.</w:t>
+        <w:t xml:space="preserve">The current COD RTO rate </w:t>
+      </w:r>
+      <w:r>
+        <w:rPr>
+          <w:color w:val="374151"/>
+        </w:rPr>
+        <w:t xml:space="preserve">is showing </w:t>
+      </w:r>
+      <w:r>
+        <w:rPr>
+          <w:color w:val="374151"/>
+        </w:rPr>
+        <w:t>at 0.18 (coincidentally at the target) — this is because the simulation's persona mix is calibrated to slightly below India's real-world benchmark. In a real deployment with actual Shiprocket data, the COD RTO rate would read 20–30% for most seller cohorts, making the savings figure materially larger. The model structure is correct; the calibration is a function of persona weights, which are documented and adjustable.</w:t>
       </w:r>
     </w:p>
     <w:p>
@@ -7556,7 +7773,7 @@
         <w:rPr>
           <w:color w:val="374151"/>
         </w:rPr>
-        <w:t>Beauty and grocery categories show the highest average loss per RTO order (₹1,200–1,300) because opened/used items cannot be resold — the logistics cost is compounded by full COGS write-off. Fashion, by contrast, shows a lower per-RTO cost (₹250 range) because the item is typically resalable. The donut chart shows 41% of total financial loss falls on non-resalable categories despite those categories representing a minority of order volume — a disproportionate impact that makes them priority candidates for risk scoring intervention.</w:t>
+        <w:t>Beauty and grocery categories show the highest average loss per RTO order (₹1,200–1,300) because opened/used items cannot be resold — the logistics cost is compounded by full COGS write-off. Fashion, by contrast, shows a lower per-RTO cost (₹250 range) because the item is typically resalable. The 41% of total financial loss falls on non-resalable categories despite those categories representing a minority of order volume — a disproportionate impact that makes them priority candidates for risk scoring intervention.</w:t>
       </w:r>
     </w:p>
     <w:p>
@@ -7676,8 +7893,13 @@
           <w:bottom w:val="single" w:sz="6" w:space="4" w:color="2563EB"/>
         </w:pBdr>
       </w:pPr>
+      <w:proofErr w:type="gramStart"/>
       <w:r>
-        <w:t>6.1  Overview of Test Programme</w:t>
+        <w:t>6.1  Overview</w:t>
+      </w:r>
+      <w:proofErr w:type="gramEnd"/>
+      <w:r>
+        <w:t xml:space="preserve"> of Test Programme</w:t>
       </w:r>
     </w:p>
     <w:p>
@@ -8114,7 +8336,7 @@
                 <w:sz w:val="20"/>
                 <w:szCs w:val="20"/>
               </w:rPr>
-              <w:t>Secondary Metrics</w:t>
+              <w:t>Secondary Metric</w:t>
             </w:r>
           </w:p>
         </w:tc>
@@ -8136,13 +8358,28 @@
             </w:tcMar>
           </w:tcPr>
           <w:p>
-            <w:r>
-              <w:rPr>
-                <w:color w:val="374151"/>
-                <w:sz w:val="20"/>
-                <w:szCs w:val="20"/>
-              </w:rPr>
-              <w:t>(1) COD conversion rate — must not drop &gt; 2pp (2) Successful delivery rate on first attempt (3) Customer repeat order rate at 30 days</w:t>
+            <w:pPr>
+              <w:rPr>
+                <w:color w:val="374151"/>
+                <w:sz w:val="20"/>
+                <w:szCs w:val="20"/>
+              </w:rPr>
+            </w:pPr>
+            <w:r>
+              <w:rPr>
+                <w:color w:val="374151"/>
+                <w:sz w:val="20"/>
+                <w:szCs w:val="20"/>
+              </w:rPr>
+              <w:t xml:space="preserve">First-attempt delivery success rate </w:t>
+            </w:r>
+            <w:r>
+              <w:rPr>
+                <w:color w:val="374151"/>
+                <w:sz w:val="20"/>
+                <w:szCs w:val="20"/>
+              </w:rPr>
+              <w:t xml:space="preserve"> </w:t>
             </w:r>
           </w:p>
         </w:tc>
@@ -8194,13 +8431,20 @@
             </w:tcMar>
           </w:tcPr>
           <w:p>
-            <w:r>
-              <w:rPr>
-                <w:color w:val="374151"/>
-                <w:sz w:val="20"/>
-                <w:szCs w:val="20"/>
-              </w:rPr>
-              <w:t>Support ticket volume related to "extra charge" complaints; NPS for checkout experience</w:t>
+            <w:pPr>
+              <w:rPr>
+                <w:color w:val="374151"/>
+                <w:sz w:val="20"/>
+                <w:szCs w:val="20"/>
+              </w:rPr>
+            </w:pPr>
+            <w:r>
+              <w:rPr>
+                <w:color w:val="374151"/>
+                <w:sz w:val="20"/>
+                <w:szCs w:val="20"/>
+              </w:rPr>
+              <w:t>Overall conversion rate (COD + Prepaid combined) of high-risk customers</w:t>
             </w:r>
           </w:p>
         </w:tc>
@@ -8606,7 +8850,7 @@
                 <w:sz w:val="20"/>
                 <w:szCs w:val="20"/>
               </w:rPr>
-              <w:t>COD RTO rate in Treatment &lt; Control at p &lt; 0.05 AND COD conversion rate drop &lt; 2pp AND support complaint rate not elevated</w:t>
+              <w:t xml:space="preserve">COD RTO rate in Treatment &lt; Control at p &lt; 0.05 </w:t>
             </w:r>
           </w:p>
         </w:tc>
@@ -8658,13 +8902,20 @@
             </w:tcMar>
           </w:tcPr>
           <w:p>
-            <w:r>
-              <w:rPr>
-                <w:color w:val="374151"/>
-                <w:sz w:val="20"/>
-                <w:szCs w:val="20"/>
-              </w:rPr>
-              <w:t>COD conversion rate drops &gt; 3pp OR support complaints spike &gt; 2x baseline within first 7 days → pause and investigate</w:t>
+            <w:pPr>
+              <w:rPr>
+                <w:color w:val="374151"/>
+                <w:sz w:val="20"/>
+                <w:szCs w:val="20"/>
+              </w:rPr>
+            </w:pPr>
+            <w:r>
+              <w:rPr>
+                <w:color w:val="374151"/>
+                <w:sz w:val="20"/>
+                <w:szCs w:val="20"/>
+              </w:rPr>
+              <w:t>Overall conversion rate drops &gt; 3 pp within the first 7–10 days → pause and investigate</w:t>
             </w:r>
           </w:p>
         </w:tc>
@@ -8683,6 +8934,7 @@
         </w:pBdr>
       </w:pPr>
       <w:r>
+        <w:lastRenderedPageBreak/>
         <w:t>Test 2 — Pre-Delivery Reschedule Nudge (NDR Reduction)</w:t>
       </w:r>
     </w:p>
@@ -9063,7 +9315,7 @@
                 <w:sz w:val="20"/>
                 <w:szCs w:val="20"/>
               </w:rPr>
-              <w:t>NDR-to-RTO conversion rate (% of NDR orders that ultimately become RTO)</w:t>
+              <w:t xml:space="preserve">NDR-to-RTO conversion rate </w:t>
             </w:r>
           </w:p>
         </w:tc>
@@ -9173,13 +9425,55 @@
             </w:tcMar>
           </w:tcPr>
           <w:p>
-            <w:r>
-              <w:rPr>
-                <w:color w:val="374151"/>
-                <w:sz w:val="20"/>
-                <w:szCs w:val="20"/>
-              </w:rPr>
-              <w:t>Opt-out rate from WhatsApp notifications (must stay &lt; 5% of Treatment cohort)</w:t>
+            <w:pPr>
+              <w:rPr>
+                <w:color w:val="374151"/>
+                <w:sz w:val="20"/>
+                <w:szCs w:val="20"/>
+              </w:rPr>
+            </w:pPr>
+            <w:proofErr w:type="gramStart"/>
+            <w:r>
+              <w:rPr>
+                <w:color w:val="374151"/>
+                <w:sz w:val="20"/>
+                <w:szCs w:val="20"/>
+              </w:rPr>
+              <w:t>Overall</w:t>
+            </w:r>
+            <w:proofErr w:type="gramEnd"/>
+            <w:r>
+              <w:rPr>
+                <w:color w:val="374151"/>
+                <w:sz w:val="20"/>
+                <w:szCs w:val="20"/>
+              </w:rPr>
+              <w:t xml:space="preserve"> first-attempt delivery success rate (should not drop)</w:t>
+            </w:r>
+            <w:r>
+              <w:rPr>
+                <w:color w:val="374151"/>
+                <w:sz w:val="20"/>
+                <w:szCs w:val="20"/>
+              </w:rPr>
+              <w:t xml:space="preserve"> </w:t>
+            </w:r>
+          </w:p>
+          <w:p>
+            <w:pPr>
+              <w:rPr>
+                <w:color w:val="374151"/>
+                <w:sz w:val="20"/>
+                <w:szCs w:val="20"/>
+              </w:rPr>
+            </w:pPr>
+            <w:r>
+              <w:rPr>
+                <w:color w:val="374151"/>
+                <w:sz w:val="20"/>
+                <w:szCs w:val="20"/>
+              </w:rPr>
+              <w:t xml:space="preserve">Post – delivery CSAT </w:t>
             </w:r>
           </w:p>
         </w:tc>
@@ -9585,7 +9879,15 @@
                 <w:sz w:val="20"/>
                 <w:szCs w:val="20"/>
               </w:rPr>
-              <w:t>NDR-to-RTO conversion rate: Treatment &lt; Control at p &lt; 0.05 AND CSAT not degraded AND opt-out rate &lt; 5%</w:t>
+              <w:t xml:space="preserve">NDR-to-RTO conversion rate: Treatment &lt; Control at p &lt; 0.05 AND CSAT not degraded AND </w:t>
+            </w:r>
+            <w:r>
+              <w:rPr>
+                <w:color w:val="374151"/>
+                <w:sz w:val="20"/>
+                <w:szCs w:val="20"/>
+              </w:rPr>
+              <w:t>first-attempt delivery success rate (should not drop)</w:t>
             </w:r>
           </w:p>
         </w:tc>
@@ -9637,15 +9939,31 @@
             </w:tcMar>
           </w:tcPr>
           <w:p>
-            <w:r>
-              <w:rPr>
-                <w:color w:val="374151"/>
-                <w:sz w:val="20"/>
-                <w:szCs w:val="20"/>
-              </w:rPr>
-              <w:t>Opt-out rate &gt; 8% in first 10 days → review message tone and frequency before continuing</w:t>
-            </w:r>
-          </w:p>
+            <w:pPr>
+              <w:rPr>
+                <w:color w:val="374151"/>
+                <w:sz w:val="20"/>
+                <w:szCs w:val="20"/>
+              </w:rPr>
+            </w:pPr>
+            <w:r>
+              <w:rPr>
+                <w:color w:val="374151"/>
+                <w:sz w:val="20"/>
+                <w:szCs w:val="20"/>
+              </w:rPr>
+              <w:t>F</w:t>
+            </w:r>
+            <w:r>
+              <w:rPr>
+                <w:color w:val="374151"/>
+                <w:sz w:val="20"/>
+                <w:szCs w:val="20"/>
+              </w:rPr>
+              <w:t>irst-attempt success rate drops noticeably within first 10 days → pause and review message + process</w:t>
+            </w:r>
+          </w:p>
+          <w:p/>
         </w:tc>
       </w:tr>
     </w:tbl>
@@ -10037,13 +10355,54 @@
             </w:tcMar>
           </w:tcPr>
           <w:p>
-            <w:r>
-              <w:rPr>
-                <w:color w:val="374151"/>
-                <w:sz w:val="20"/>
-                <w:szCs w:val="20"/>
-              </w:rPr>
-              <w:t>Pin-drop usage rate (% of orders where address was set by pin-drop rather than manual text)</w:t>
+            <w:pPr>
+              <w:rPr>
+                <w:color w:val="374151"/>
+                <w:sz w:val="20"/>
+                <w:szCs w:val="20"/>
+              </w:rPr>
+            </w:pPr>
+            <w:r>
+              <w:rPr>
+                <w:color w:val="374151"/>
+                <w:sz w:val="20"/>
+                <w:szCs w:val="20"/>
+              </w:rPr>
+              <w:t>Pin-drop usage rate (% of orders where address was set by pin-drop rather than manual text</w:t>
+            </w:r>
+            <w:proofErr w:type="gramStart"/>
+            <w:r>
+              <w:rPr>
+                <w:color w:val="374151"/>
+                <w:sz w:val="20"/>
+                <w:szCs w:val="20"/>
+              </w:rPr>
+              <w:t>)</w:t>
+            </w:r>
+            <w:r>
+              <w:rPr>
+                <w:color w:val="374151"/>
+                <w:sz w:val="20"/>
+                <w:szCs w:val="20"/>
+              </w:rPr>
+              <w:t xml:space="preserve"> ,</w:t>
+            </w:r>
+            <w:proofErr w:type="gramEnd"/>
+            <w:r>
+              <w:rPr>
+                <w:color w:val="374151"/>
+                <w:sz w:val="20"/>
+                <w:szCs w:val="20"/>
+              </w:rPr>
+              <w:t xml:space="preserve"> </w:t>
+            </w:r>
+            <w:r>
+              <w:rPr>
+                <w:color w:val="374151"/>
+                <w:sz w:val="20"/>
+                <w:szCs w:val="20"/>
+              </w:rPr>
+              <w:t>Address-error NDR rate</w:t>
             </w:r>
           </w:p>
         </w:tc>
@@ -10095,13 +10454,20 @@
             </w:tcMar>
           </w:tcPr>
           <w:p>
-            <w:r>
-              <w:rPr>
-                <w:color w:val="374151"/>
-                <w:sz w:val="20"/>
-                <w:szCs w:val="20"/>
-              </w:rPr>
-              <w:t>Address-error NDR rate (NDR reason = "Address issue" as % of total orders)</w:t>
+            <w:pPr>
+              <w:rPr>
+                <w:color w:val="374151"/>
+                <w:sz w:val="20"/>
+                <w:szCs w:val="20"/>
+              </w:rPr>
+            </w:pPr>
+            <w:r>
+              <w:rPr>
+                <w:color w:val="374151"/>
+                <w:sz w:val="20"/>
+                <w:szCs w:val="20"/>
+              </w:rPr>
+              <w:t>Mobile session abandonment rate</w:t>
             </w:r>
           </w:p>
         </w:tc>
@@ -10161,6 +10527,14 @@
               </w:rPr>
               <w:t>Checkout completion rate — must not drop &gt; 1pp; mobile session abandonment rate</w:t>
             </w:r>
+            <w:r>
+              <w:rPr>
+                <w:color w:val="374151"/>
+                <w:sz w:val="20"/>
+                <w:szCs w:val="20"/>
+              </w:rPr>
+              <w:t xml:space="preserve">. </w:t>
+            </w:r>
           </w:p>
         </w:tc>
       </w:tr>
@@ -10327,13 +10701,20 @@
             </w:tcMar>
           </w:tcPr>
           <w:p>
-            <w:r>
-              <w:rPr>
-                <w:color w:val="374151"/>
-                <w:sz w:val="20"/>
-                <w:szCs w:val="20"/>
-              </w:rPr>
-              <w:t>2 weeks (high-volume, fast-accumulating metric)</w:t>
+            <w:pPr>
+              <w:rPr>
+                <w:color w:val="374151"/>
+                <w:sz w:val="20"/>
+                <w:szCs w:val="20"/>
+              </w:rPr>
+            </w:pPr>
+            <w:r>
+              <w:rPr>
+                <w:color w:val="374151"/>
+                <w:sz w:val="20"/>
+                <w:szCs w:val="20"/>
+              </w:rPr>
+              <w:t>6–8 weeks (enough time for Address-error NDR to mature)</w:t>
             </w:r>
           </w:p>
         </w:tc>
@@ -10385,13 +10766,20 @@
             </w:tcMar>
           </w:tcPr>
           <w:p>
-            <w:r>
-              <w:rPr>
-                <w:color w:val="374151"/>
-                <w:sz w:val="20"/>
-                <w:szCs w:val="20"/>
-              </w:rPr>
-              <w:t>Pin-drop usage rate: Treatment &gt; Control at p &lt; 0.05 AND checkout completion not degraded</w:t>
+            <w:pPr>
+              <w:rPr>
+                <w:color w:val="374151"/>
+                <w:sz w:val="20"/>
+                <w:szCs w:val="20"/>
+              </w:rPr>
+            </w:pPr>
+            <w:r>
+              <w:rPr>
+                <w:color w:val="374151"/>
+                <w:sz w:val="20"/>
+                <w:szCs w:val="20"/>
+              </w:rPr>
+              <w:t>Both primary metrics improve: Pin-drop usage rate higher in Treatment (p &lt; 0.05) and Address-error NDR rate lower in Treatment (p &lt; 0.05). Checkout completion must not drop &gt; 1pp.</w:t>
             </w:r>
           </w:p>
         </w:tc>
@@ -10442,16 +10830,70 @@
               <w:right w:w="120" w:type="dxa"/>
             </w:tcMar>
           </w:tcPr>
-          <w:p>
-            <w:r>
-              <w:rPr>
-                <w:color w:val="374151"/>
-                <w:sz w:val="20"/>
-                <w:szCs w:val="20"/>
-              </w:rPr>
-              <w:t>This is a leading-indicator test. Address-error NDR reduction may require 6–8 weeks of delivery data to manifest with statistical power. Pin-drop usage rate is used as a validated proxy metric.</w:t>
-            </w:r>
-          </w:p>
+          <w:tbl>
+            <w:tblPr>
+              <w:tblW w:w="0" w:type="auto"/>
+              <w:tblCellSpacing w:w="15" w:type="dxa"/>
+              <w:tblCellMar>
+                <w:top w:w="15" w:type="dxa"/>
+                <w:left w:w="15" w:type="dxa"/>
+                <w:bottom w:w="15" w:type="dxa"/>
+                <w:right w:w="15" w:type="dxa"/>
+              </w:tblCellMar>
+              <w:tblLook w:val="04A0" w:firstRow="1" w:lastRow="0" w:firstColumn="1" w:lastColumn="0" w:noHBand="0" w:noVBand="1"/>
+            </w:tblPr>
+            <w:tblGrid>
+              <w:gridCol w:w="81"/>
+              <w:gridCol w:w="6439"/>
+            </w:tblGrid>
+            <w:tr>
+              <w:trPr>
+                <w:trHeight w:val="712"/>
+                <w:tblCellSpacing w:w="15" w:type="dxa"/>
+              </w:trPr>
+              <w:tc>
+                <w:tcPr>
+                  <w:tcW w:w="0" w:type="auto"/>
+                  <w:vAlign w:val="center"/>
+                  <w:hideMark/>
+                </w:tcPr>
+                <w:p>
+                  <w:pPr>
+                    <w:rPr>
+                      <w:rFonts w:eastAsia="Times New Roman"/>
+                      <w:sz w:val="20"/>
+                      <w:szCs w:val="20"/>
+                    </w:rPr>
+                  </w:pPr>
+                </w:p>
+              </w:tc>
+              <w:tc>
+                <w:tcPr>
+                  <w:tcW w:w="0" w:type="auto"/>
+                  <w:vAlign w:val="center"/>
+                  <w:hideMark/>
+                </w:tcPr>
+                <w:p>
+                  <w:pPr>
+                    <w:rPr>
+                      <w:rFonts w:eastAsia="Times New Roman"/>
+                      <w:sz w:val="20"/>
+                      <w:szCs w:val="20"/>
+                    </w:rPr>
+                  </w:pPr>
+                  <w:r>
+                    <w:rPr>
+                      <w:rFonts w:eastAsia="Times New Roman"/>
+                      <w:sz w:val="20"/>
+                      <w:szCs w:val="20"/>
+                    </w:rPr>
+                    <w:t>Dual primary metrics. Pin-drop usage is the leading indicator; Address-error NDR is the business outcome. Final decision requires both to move in the right direction.</w:t>
+                  </w:r>
+                </w:p>
+              </w:tc>
+            </w:tr>
+          </w:tbl>
+          <w:p/>
         </w:tc>
       </w:tr>
     </w:tbl>
@@ -11075,13 +11517,20 @@
             </w:tcMar>
           </w:tcPr>
           <w:p>
-            <w:r>
-              <w:rPr>
-                <w:color w:val="374151"/>
-                <w:sz w:val="20"/>
-                <w:szCs w:val="20"/>
-              </w:rPr>
-              <w:t>~2,000 SKU-level return observations per arm (requires seller cohorts of sufficient size; pilot with top-200 fashion sellers)</w:t>
+            <w:pPr>
+              <w:rPr>
+                <w:color w:val="374151"/>
+                <w:sz w:val="20"/>
+                <w:szCs w:val="20"/>
+              </w:rPr>
+            </w:pPr>
+            <w:r>
+              <w:rPr>
+                <w:color w:val="374151"/>
+                <w:sz w:val="20"/>
+                <w:szCs w:val="20"/>
+              </w:rPr>
+              <w:t xml:space="preserve">180 sellers per arm </w:t>
             </w:r>
           </w:p>
         </w:tc>
@@ -11197,7 +11646,7 @@
                 <w:sz w:val="20"/>
                 <w:szCs w:val="20"/>
               </w:rPr>
-              <w:t>Return rate on flagged SKUs: Treatment &lt; Control at p &lt; 0.05 AND seller engagement with panel &gt; 40% (at least one session on the panel per seller)</w:t>
+              <w:t xml:space="preserve">Return rate on flagged SKUs: Treatment &lt; Control at p &lt; 0.05 </w:t>
             </w:r>
           </w:p>
         </w:tc>
@@ -11215,8 +11664,13 @@
           <w:bottom w:val="single" w:sz="6" w:space="4" w:color="2563EB"/>
         </w:pBdr>
       </w:pPr>
+      <w:proofErr w:type="gramStart"/>
       <w:r>
-        <w:t>6.2  Test Sequencing &amp; Rollout Plan</w:t>
+        <w:t>6.2  Test</w:t>
+      </w:r>
+      <w:proofErr w:type="gramEnd"/>
+      <w:r>
+        <w:t xml:space="preserve"> Sequencing &amp; Rollout Plan</w:t>
       </w:r>
     </w:p>
     <w:tbl>
@@ -11909,8 +12363,13 @@
           <w:bottom w:val="single" w:sz="6" w:space="4" w:color="2563EB"/>
         </w:pBdr>
       </w:pPr>
+      <w:proofErr w:type="gramStart"/>
       <w:r>
-        <w:t>7.1  Summary of Findings</w:t>
+        <w:t>7.1  Summary</w:t>
+      </w:r>
+      <w:proofErr w:type="gramEnd"/>
+      <w:r>
+        <w:t xml:space="preserve"> of Findings</w:t>
       </w:r>
     </w:p>
     <w:tbl>
@@ -12092,7 +12551,7 @@
                 <w:sz w:val="20"/>
                 <w:szCs w:val="20"/>
               </w:rPr>
-              <w:t>Dashboard: 23% RTO in this segment vs 5% prepaid/metro floor</w:t>
+              <w:t>23% RTO in this segment vs 5% prepaid/metro floor</w:t>
             </w:r>
           </w:p>
         </w:tc>
@@ -12518,8 +12977,13 @@
           <w:bottom w:val="single" w:sz="6" w:space="4" w:color="2563EB"/>
         </w:pBdr>
       </w:pPr>
+      <w:proofErr w:type="gramStart"/>
       <w:r>
-        <w:t>7.2  Metric Goals</w:t>
+        <w:t>7.2  Metric</w:t>
+      </w:r>
+      <w:proofErr w:type="gramEnd"/>
+      <w:r>
+        <w:t xml:space="preserve"> Goals</w:t>
       </w:r>
     </w:p>
     <w:tbl>
@@ -13077,7 +13541,15 @@
                 <w:sz w:val="20"/>
                 <w:szCs w:val="20"/>
               </w:rPr>
-              <w:t>79–83% (declining)</w:t>
+              <w:t>80</w:t>
+            </w:r>
+            <w:r>
+              <w:rPr>
+                <w:color w:val="374151"/>
+                <w:sz w:val="20"/>
+                <w:szCs w:val="20"/>
+              </w:rPr>
+              <w:t xml:space="preserve">% </w:t>
             </w:r>
           </w:p>
         </w:tc>
@@ -13379,8 +13851,13 @@
           <w:bottom w:val="single" w:sz="6" w:space="4" w:color="2563EB"/>
         </w:pBdr>
       </w:pPr>
+      <w:proofErr w:type="gramStart"/>
       <w:r>
-        <w:t>7.3  What This Project Demonstrates</w:t>
+        <w:t>7.3  What</w:t>
+      </w:r>
+      <w:proofErr w:type="gramEnd"/>
+      <w:r>
+        <w:t xml:space="preserve"> This Project Demonstrates</w:t>
       </w:r>
     </w:p>
     <w:p>
@@ -13440,7 +13917,13 @@
         <w:rPr>
           <w:color w:val="374151"/>
         </w:rPr>
-        <w:t>Data architecture: designing a simulation dataset that encodes domain knowledge rather than using a generic proxy, with explicit no-leakage design across time-ordered events</w:t>
+        <w:t>Data architecture: designing a simulation dataset that encodes domain knowledge rather than using a generic proxy</w:t>
+      </w:r>
+      <w:r>
+        <w:rPr>
+          <w:color w:val="374151"/>
+        </w:rPr>
+        <w:t xml:space="preserve">. </w:t>
       </w:r>
     </w:p>
     <w:p>
@@ -13491,93 +13974,6 @@
         <w:t>Business translation: converting RTO rates into ₹ monthly loss figures and ₹ opportunity-at-goal — the language that drives prioritisation decisions</w:t>
       </w:r>
     </w:p>
-    <w:p>
-      <w:pPr>
-        <w:spacing w:before="60" w:after="60"/>
-      </w:pPr>
-    </w:p>
-    <w:tbl>
-      <w:tblPr>
-        <w:tblW w:w="9360" w:type="dxa"/>
-        <w:tblBorders>
-          <w:top w:val="single" w:sz="4" w:space="0" w:color="auto"/>
-          <w:left w:val="single" w:sz="4" w:space="0" w:color="auto"/>
-          <w:bottom w:val="single" w:sz="4" w:space="0" w:color="auto"/>
-          <w:right w:val="single" w:sz="4" w:space="0" w:color="auto"/>
-          <w:insideH w:val="single" w:sz="4" w:space="0" w:color="auto"/>
-          <w:insideV w:val="single" w:sz="4" w:space="0" w:color="auto"/>
-        </w:tblBorders>
-        <w:tblCellMar>
-          <w:left w:w="10" w:type="dxa"/>
-          <w:right w:w="10" w:type="dxa"/>
-        </w:tblCellMar>
-        <w:tblLook w:val="0000" w:firstRow="0" w:lastRow="0" w:firstColumn="0" w:lastColumn="0" w:noHBand="0" w:noVBand="0"/>
-      </w:tblPr>
-      <w:tblGrid>
-        <w:gridCol w:w="9360"/>
-      </w:tblGrid>
-      <w:tr>
-        <w:tc>
-          <w:tcPr>
-            <w:tcW w:w="9360" w:type="dxa"/>
-            <w:tcBorders>
-              <w:top w:val="none" w:sz="0" w:space="0" w:color="FFFFFF"/>
-              <w:left w:val="single" w:sz="18" w:space="0" w:color="2563EB"/>
-              <w:bottom w:val="none" w:sz="0" w:space="0" w:color="FFFFFF"/>
-              <w:right w:val="none" w:sz="0" w:space="0" w:color="FFFFFF"/>
-            </w:tcBorders>
-            <w:shd w:val="clear" w:color="auto" w:fill="F8FAFC"/>
-            <w:tcMar>
-              <w:top w:w="100" w:type="dxa"/>
-              <w:left w:w="200" w:type="dxa"/>
-              <w:bottom w:w="100" w:type="dxa"/>
-              <w:right w:w="160" w:type="dxa"/>
-            </w:tcMar>
-          </w:tcPr>
-          <w:p>
-            <w:pPr>
-              <w:spacing w:after="60"/>
-            </w:pPr>
-            <w:r>
-              <w:rPr>
-                <w:b/>
-                <w:bCs/>
-                <w:color w:val="1B3A6B"/>
-              </w:rPr>
-              <w:t>Open Questions for Further Investigation</w:t>
-            </w:r>
-          </w:p>
-          <w:p>
-            <w:r>
-              <w:rPr>
-                <w:color w:val="374151"/>
-                <w:sz w:val="21"/>
-                <w:szCs w:val="21"/>
-              </w:rPr>
-              <w:t xml:space="preserve">1. What is the actual COD RTO rate by Shiprocket seller vertical? (Would allow calibration of the risk-score multipliers beyond the simulated estimates.) 2. Does the pre-delivery call currently happen before or after the courier leaves the hub? (Determines whether Test 2 requires a process change or only a notification-timing change.) 3. What is the current NDR reattempt SLA across </w:t>
-            </w:r>
-            <w:proofErr w:type="spellStart"/>
-            <w:r>
-              <w:rPr>
-                <w:color w:val="374151"/>
-                <w:sz w:val="21"/>
-                <w:szCs w:val="21"/>
-              </w:rPr>
-              <w:t>Shiprocket's</w:t>
-            </w:r>
-            <w:proofErr w:type="spellEnd"/>
-            <w:r>
-              <w:rPr>
-                <w:color w:val="374151"/>
-                <w:sz w:val="21"/>
-                <w:szCs w:val="21"/>
-              </w:rPr>
-              <w:t xml:space="preserve"> courier partners? (A 48-hour reattempt vs 24-hour window dramatically changes NDR rescue rate independently of customer communication improvements.)</w:t>
-            </w:r>
-          </w:p>
-        </w:tc>
-      </w:tr>
-    </w:tbl>
     <w:p>
       <w:pPr>
         <w:spacing w:before="60" w:after="60"/>
@@ -13723,7 +14119,34 @@
         <w:sz w:val="18"/>
         <w:szCs w:val="18"/>
       </w:rPr>
-      <w:t>RTO &amp; NDR Intelligence Framework  |  Devesh Dwivedi</w:t>
+      <w:t xml:space="preserve">RTO &amp; NDR Intelligence </w:t>
+    </w:r>
+    <w:proofErr w:type="gramStart"/>
+    <w:r>
+      <w:rPr>
+        <w:color w:val="6B7280"/>
+        <w:sz w:val="18"/>
+        <w:szCs w:val="18"/>
+      </w:rPr>
+      <w:t>Framework  |</w:t>
+    </w:r>
+    <w:proofErr w:type="gramEnd"/>
+    <w:r>
+      <w:rPr>
+        <w:color w:val="6B7280"/>
+        <w:sz w:val="18"/>
+        <w:szCs w:val="18"/>
+      </w:rPr>
+      <w:t xml:space="preserve">  Devesh </w:t>
+    </w:r>
+    <w:proofErr w:type="gramStart"/>
+    <w:r>
+      <w:rPr>
+        <w:color w:val="6B7280"/>
+        <w:sz w:val="18"/>
+        <w:szCs w:val="18"/>
+      </w:rPr>
+      <w:t>Dwivedi</w:t>
     </w:r>
     <w:r>
       <w:rPr>
@@ -13731,7 +14154,34 @@
         <w:sz w:val="18"/>
         <w:szCs w:val="18"/>
       </w:rPr>
-      <w:t xml:space="preserve">  —  Shiprocket Product Analytics</w:t>
+      <w:t xml:space="preserve">  —</w:t>
+    </w:r>
+    <w:proofErr w:type="gramEnd"/>
+    <w:r>
+      <w:rPr>
+        <w:color w:val="2563EB"/>
+        <w:sz w:val="18"/>
+        <w:szCs w:val="18"/>
+      </w:rPr>
+      <w:t xml:space="preserve">  </w:t>
+    </w:r>
+    <w:proofErr w:type="spellStart"/>
+    <w:r>
+      <w:rPr>
+        <w:color w:val="2563EB"/>
+        <w:sz w:val="18"/>
+        <w:szCs w:val="18"/>
+      </w:rPr>
+      <w:t>Shiprocket</w:t>
+    </w:r>
+    <w:proofErr w:type="spellEnd"/>
+    <w:r>
+      <w:rPr>
+        <w:color w:val="2563EB"/>
+        <w:sz w:val="18"/>
+        <w:szCs w:val="18"/>
+      </w:rPr>
+      <w:t xml:space="preserve"> Product Analytics</w:t>
     </w:r>
   </w:p>
 </w:hdr>
@@ -13826,6 +14276,95 @@
     </w:lvl>
   </w:abstractNum>
   <w:abstractNum w:abstractNumId="1" w15:restartNumberingAfterBreak="0">
+    <w:nsid w:val="60031B09"/>
+    <w:multiLevelType w:val="hybridMultilevel"/>
+    <w:tmpl w:val="DA2A3ED2"/>
+    <w:lvl w:ilvl="0" w:tplc="74BA8856">
+      <w:start w:val="1"/>
+      <w:numFmt w:val="decimal"/>
+      <w:lvlText w:val="(%1)"/>
+      <w:lvlJc w:val="left"/>
+      <w:pPr>
+        <w:ind w:left="720" w:hanging="360"/>
+      </w:pPr>
+      <w:rPr>
+        <w:rFonts w:hint="default"/>
+      </w:rPr>
+    </w:lvl>
+    <w:lvl w:ilvl="1" w:tplc="40090019" w:tentative="1">
+      <w:start w:val="1"/>
+      <w:numFmt w:val="lowerLetter"/>
+      <w:lvlText w:val="%2."/>
+      <w:lvlJc w:val="left"/>
+      <w:pPr>
+        <w:ind w:left="1440" w:hanging="360"/>
+      </w:pPr>
+    </w:lvl>
+    <w:lvl w:ilvl="2" w:tplc="4009001B" w:tentative="1">
+      <w:start w:val="1"/>
+      <w:numFmt w:val="lowerRoman"/>
+      <w:lvlText w:val="%3."/>
+      <w:lvlJc w:val="right"/>
+      <w:pPr>
+        <w:ind w:left="2160" w:hanging="180"/>
+      </w:pPr>
+    </w:lvl>
+    <w:lvl w:ilvl="3" w:tplc="4009000F" w:tentative="1">
+      <w:start w:val="1"/>
+      <w:numFmt w:val="decimal"/>
+      <w:lvlText w:val="%4."/>
+      <w:lvlJc w:val="left"/>
+      <w:pPr>
+        <w:ind w:left="2880" w:hanging="360"/>
+      </w:pPr>
+    </w:lvl>
+    <w:lvl w:ilvl="4" w:tplc="40090019" w:tentative="1">
+      <w:start w:val="1"/>
+      <w:numFmt w:val="lowerLetter"/>
+      <w:lvlText w:val="%5."/>
+      <w:lvlJc w:val="left"/>
+      <w:pPr>
+        <w:ind w:left="3600" w:hanging="360"/>
+      </w:pPr>
+    </w:lvl>
+    <w:lvl w:ilvl="5" w:tplc="4009001B" w:tentative="1">
+      <w:start w:val="1"/>
+      <w:numFmt w:val="lowerRoman"/>
+      <w:lvlText w:val="%6."/>
+      <w:lvlJc w:val="right"/>
+      <w:pPr>
+        <w:ind w:left="4320" w:hanging="180"/>
+      </w:pPr>
+    </w:lvl>
+    <w:lvl w:ilvl="6" w:tplc="4009000F" w:tentative="1">
+      <w:start w:val="1"/>
+      <w:numFmt w:val="decimal"/>
+      <w:lvlText w:val="%7."/>
+      <w:lvlJc w:val="left"/>
+      <w:pPr>
+        <w:ind w:left="5040" w:hanging="360"/>
+      </w:pPr>
+    </w:lvl>
+    <w:lvl w:ilvl="7" w:tplc="40090019" w:tentative="1">
+      <w:start w:val="1"/>
+      <w:numFmt w:val="lowerLetter"/>
+      <w:lvlText w:val="%8."/>
+      <w:lvlJc w:val="left"/>
+      <w:pPr>
+        <w:ind w:left="5760" w:hanging="360"/>
+      </w:pPr>
+    </w:lvl>
+    <w:lvl w:ilvl="8" w:tplc="4009001B" w:tentative="1">
+      <w:start w:val="1"/>
+      <w:numFmt w:val="lowerRoman"/>
+      <w:lvlText w:val="%9."/>
+      <w:lvlJc w:val="right"/>
+      <w:pPr>
+        <w:ind w:left="6480" w:hanging="180"/>
+      </w:pPr>
+    </w:lvl>
+  </w:abstractNum>
+  <w:abstractNum w:abstractNumId="2" w15:restartNumberingAfterBreak="0">
     <w:nsid w:val="767B20B2"/>
     <w:multiLevelType w:val="hybridMultilevel"/>
     <w:tmpl w:val="E6C25CD2"/>
@@ -13879,7 +14418,7 @@
       <w:lvlJc w:val="left"/>
     </w:lvl>
   </w:abstractNum>
-  <w:abstractNum w:abstractNumId="2" w15:restartNumberingAfterBreak="0">
+  <w:abstractNum w:abstractNumId="3" w15:restartNumberingAfterBreak="0">
     <w:nsid w:val="7E0B39ED"/>
     <w:multiLevelType w:val="hybridMultilevel"/>
     <w:tmpl w:val="DB502226"/>
@@ -13940,10 +14479,13 @@
     </w:lvlOverride>
   </w:num>
   <w:num w:numId="2" w16cid:durableId="1262370053">
-    <w:abstractNumId w:val="2"/>
+    <w:abstractNumId w:val="3"/>
     <w:lvlOverride w:ilvl="0">
       <w:startOverride w:val="1"/>
     </w:lvlOverride>
+  </w:num>
+  <w:num w:numId="3" w16cid:durableId="122356777">
+    <w:abstractNumId w:val="1"/>
   </w:num>
 </w:numbering>
 </file>
@@ -14342,6 +14884,7 @@
   <w:style w:type="paragraph" w:default="1" w:styleId="Normal">
     <w:name w:val="Normal"/>
     <w:qFormat/>
+    <w:rsid w:val="009A5E7F"/>
   </w:style>
   <w:style w:type="paragraph" w:styleId="Heading1">
     <w:name w:val="heading 1"/>
@@ -14437,7 +14980,6 @@
   <w:style w:type="character" w:default="1" w:styleId="DefaultParagraphFont">
     <w:name w:val="Default Paragraph Font"/>
     <w:uiPriority w:val="1"/>
-    <w:semiHidden/>
     <w:unhideWhenUsed/>
   </w:style>
   <w:style w:type="table" w:default="1" w:styleId="TableNormal">
@@ -14551,6 +15093,19 @@
     <w:rPr>
       <w:sz w:val="20"/>
       <w:szCs w:val="20"/>
+    </w:rPr>
+  </w:style>
+  <w:style w:type="paragraph" w:styleId="NormalWeb">
+    <w:name w:val="Normal (Web)"/>
+    <w:basedOn w:val="Normal"/>
+    <w:uiPriority w:val="99"/>
+    <w:semiHidden/>
+    <w:unhideWhenUsed/>
+    <w:rsid w:val="002242F4"/>
+    <w:rPr>
+      <w:rFonts w:ascii="Times New Roman" w:hAnsi="Times New Roman" w:cs="Times New Roman"/>
+      <w:sz w:val="24"/>
+      <w:szCs w:val="24"/>
     </w:rPr>
   </w:style>
 </w:styles>

</xml_diff>